<commit_message>
Linn case study: do not count Duane Arnold Solar IV; queue a Nicholas wind lead
Both readings of the Duane Arnold Solar IV lead rejected it as a
contested project: its one public meeting drew roughly evenly split
comment and no opposition, petition, denial or appeal. The Linn report
had counted it as a fifth opposition record; it now counts the four the
platform publishes (93rd percentile nationally, 26th in Iowa per
resident), lists no pending contested project, and describes Solar IV as
proposed and not contested. The Jones County note now says the review
queue holds its battery-storage moratorium as expired.

Also queues q_f97e808073, a Nicholas County wind moratorium (Ordinance
26-August-02) reported by the reviewer of the county's old negative
check, as a lead for triage and a blind reading.

Co-Authored-By: Claude Opus 5.5 <noreply@anthropic.com>
Claude-Session: https://claude.ai/code/session_01NJWbkoHtNChAFFjQ4Wfqfz
</commit_message>
<xml_diff>
--- a/deliverables/case_study_templates/renewables_2026-10-16/Example_Case_Study_Linn_County_IA_Renewables.docx
+++ b/deliverables/case_study_templates/renewables_2026-10-16/Example_Case_Study_Linn_County_IA_Renewables.docx
@@ -768,7 +768,7 @@
                 <w:b/>
                 <w:sz w:val="20"/>
               </w:rPr>
-              <w:t>0 blocked; 2 advanced; 1 pending</w:t>
+              <w:t>0 blocked; 2 advanced</w:t>
             </w:r>
           </w:p>
         </w:tc>
@@ -791,7 +791,7 @@
               <w:rPr>
                 <w:sz w:val="20"/>
               </w:rPr>
-              <w:t>Coggon and Duane Arnold Solar I and II approved and upheld; Duane Arnold Solar IV pending</w:t>
+              <w:t>Coggon and Duane Arnold Solar I and II approved and upheld</w:t>
             </w:r>
           </w:p>
         </w:tc>
@@ -841,7 +841,7 @@
                 <w:b/>
                 <w:sz w:val="20"/>
               </w:rPr>
-              <w:t>95</w:t>
+              <w:t>93</w:t>
             </w:r>
             <w:r>
               <w:rPr>
@@ -849,14 +849,14 @@
                 <w:sz w:val="20"/>
                 <w:vertAlign w:val="superscript"/>
               </w:rPr>
-              <w:t>th</w:t>
+              <w:t>rd</w:t>
             </w:r>
             <w:r>
               <w:rPr>
                 <w:b/>
                 <w:sz w:val="20"/>
               </w:rPr>
-              <w:t xml:space="preserve"> percentile (records); 67</w:t>
+              <w:t xml:space="preserve"> percentile (records); 65</w:t>
             </w:r>
             <w:r>
               <w:rPr>
@@ -893,7 +893,7 @@
               <w:rPr>
                 <w:sz w:val="20"/>
               </w:rPr>
-              <w:t>Two restriction instruments and three contested projects, against all U.S. counties</w:t>
+              <w:t>Two restriction instruments and two contested projects, against all U.S. counties</w:t>
             </w:r>
           </w:p>
         </w:tc>
@@ -909,7 +909,7 @@
         <w:spacing w:after="200"/>
       </w:pPr>
       <w:r>
-        <w:t>Ratings as of October 16, 2026. The score is a calibrated, cross-validated resemblance measure, not a forecast for any project. Opposition intensity adds Duane Arnold Solar IV, found in this review, to the four records the platform published on October 13. "How to Read Hawthorn Intelligence Reports" below defines each scale.</w:t>
+        <w:t>Ratings as of October 16, 2026. The score is a calibrated, cross-validated resemblance measure, not a forecast for any project. Opposition intensity counts the four records the platform published on October 13. Duane Arnold Solar IV was reviewed and not added: the record of its one public meeting shows mixed comment, not opposition. "How to Read Hawthorn Intelligence Reports" below defines each scale.</w:t>
       </w:r>
     </w:p>
     <w:p>
@@ -3157,7 +3157,7 @@
               <w:rPr>
                 <w:sz w:val="18"/>
               </w:rPr>
-              <w:t>Opposition records (this review)</w:t>
+              <w:t>Opposition records</w:t>
             </w:r>
           </w:p>
         </w:tc>
@@ -3186,7 +3186,7 @@
               <w:rPr>
                 <w:sz w:val="18"/>
               </w:rPr>
-              <w:t>5</w:t>
+              <w:t>4</w:t>
             </w:r>
           </w:p>
         </w:tc>
@@ -3215,7 +3215,7 @@
               <w:rPr>
                 <w:sz w:val="18"/>
               </w:rPr>
-              <w:t>95</w:t>
+              <w:t>93</w:t>
             </w:r>
           </w:p>
         </w:tc>
@@ -3244,7 +3244,7 @@
               <w:rPr>
                 <w:sz w:val="18"/>
               </w:rPr>
-              <w:t>99</w:t>
+              <w:t>97</w:t>
             </w:r>
           </w:p>
         </w:tc>
@@ -3336,7 +3336,7 @@
               <w:rPr>
                 <w:sz w:val="18"/>
               </w:rPr>
-              <w:t>2.2</w:t>
+              <w:t>1.7</w:t>
             </w:r>
           </w:p>
         </w:tc>
@@ -3365,7 +3365,7 @@
               <w:rPr>
                 <w:sz w:val="18"/>
               </w:rPr>
-              <w:t>67</w:t>
+              <w:t>65</w:t>
             </w:r>
           </w:p>
         </w:tc>
@@ -3394,7 +3394,7 @@
               <w:rPr>
                 <w:sz w:val="18"/>
               </w:rPr>
-              <w:t>27</w:t>
+              <w:t>26</w:t>
             </w:r>
           </w:p>
         </w:tc>
@@ -5778,16 +5778,16 @@
         <w:footnoteReference w:id="6"/>
       </w:r>
       <w:r>
-        <w:t xml:space="preserve"> have a median score of 0.41, and four of the ten have a severe restriction on record. Linn has none in force: it approved contested projects, defended them in court and regulated rather than banned. Its five records put it in the 95</w:t>
+        <w:t xml:space="preserve"> have a median score of 0.41, and four of the ten have a severe restriction on record. Linn has none in force: it approved contested projects, defended them in court and regulated rather than banned. Its four records put it in the 93</w:t>
       </w:r>
       <w:r>
         <w:rPr>
           <w:vertAlign w:val="superscript"/>
         </w:rPr>
-        <w:t>th</w:t>
-      </w:r>
-      <w:r>
-        <w:t xml:space="preserve"> percentile nationally by count, but per resident only the 27</w:t>
+        <w:t>rd</w:t>
+      </w:r>
+      <w:r>
+        <w:t xml:space="preserve"> percentile nationally by count, but per resident only the 26</w:t>
       </w:r>
       <w:r>
         <w:rPr>
@@ -8167,7 +8167,7 @@
               <w:rPr>
                 <w:sz w:val="18"/>
               </w:rPr>
-              <w:t>Duane Arnold Solar IV (220 MW solar, up to 180 MW storage)</w:t>
+              <w:t>None (Duane Arnold Solar IV is proposed, but its record shows no opposition)</w:t>
             </w:r>
           </w:p>
         </w:tc>
@@ -8471,7 +8471,7 @@
         <w:pStyle w:val="ListParagraph"/>
         <w:numPr>
           <w:ilvl w:val="0"/>
-          <w:numId w:val="14"/>
+          <w:numId w:val="15"/>
         </w:numPr>
         <w:spacing w:after="80"/>
       </w:pPr>
@@ -8501,7 +8501,7 @@
         <w:pStyle w:val="ListParagraph"/>
         <w:numPr>
           <w:ilvl w:val="0"/>
-          <w:numId w:val="14"/>
+          <w:numId w:val="15"/>
         </w:numPr>
         <w:spacing w:after="80"/>
       </w:pPr>
@@ -8529,7 +8529,7 @@
         <w:pStyle w:val="ListParagraph"/>
         <w:numPr>
           <w:ilvl w:val="0"/>
-          <w:numId w:val="14"/>
+          <w:numId w:val="15"/>
         </w:numPr>
         <w:spacing w:after="80"/>
       </w:pPr>
@@ -8540,7 +8540,7 @@
         <w:t>Duane Arnold Solar IV</w:t>
       </w:r>
       <w:r>
-        <w:t xml:space="preserve"> (NextEra): 220 MW of solar and up to 180 MW of storage on about 1,460 acres; public meeting July 24, 2024 under Iowa Utilities Commission docket GCU-2024-0002; no county or state decision found.</w:t>
+        <w:t xml:space="preserve"> (NextEra), proposed, not contested on the record: 220 MW of solar and up to 180 MW of storage on about 1,460 acres; at the July 24, 2024 public meeting under Iowa Utilities Commission docket GCU-2024-0002, speakers were roughly evenly split; no county or state decision found.</w:t>
       </w:r>
     </w:p>
     <w:p>
@@ -9875,7 +9875,7 @@
           <w:sz w:val="16"/>
           <w:szCs w:val="16"/>
         </w:rPr>
-        <w:t xml:space="preserve"> Percentiles are mid-rank: the share of counties below Linn plus half of ties. The margin row ranks Democratic lean. Opposition records add Duane Arnold Solar IV, which the platform's published data does not yet hold, to its two restriction instruments and two contested projects; all other counties' records are as published. Demographic rows show the model inputs (ACS 2020-2024). Linn's 2.5 MW of wind is a single turbine that EIA lists as retired in 2025; the model's wind input counts operating and retired capacity.</w:t>
+        <w:t xml:space="preserve"> Percentiles are mid-rank: the share of counties below Linn plus half of ties. The margin row ranks Democratic lean. Records are as published by the platform on October 13, 2026 (two restriction instruments and two contested projects); Duane Arnold Solar IV was reviewed for this report and not counted. Demographic rows show the model inputs (ACS 2020-2024). Linn's 2.5 MW of wind is a single turbine that EIA lists as retired in 2025; the model's wind input counts operating and retired capacity.</w:t>
       </w:r>
     </w:p>
   </w:footnote>
@@ -9947,7 +9947,7 @@
           <w:sz w:val="16"/>
           <w:szCs w:val="16"/>
         </w:rPr>
-        <w:t xml:space="preserve"> Scores describe county profiles, not restriction status. Cedar's severe record is its 2023 solar ordinance (1,250 feet from residences, half a mile between projects); Buchanan's is a battery-storage moratorium adopted January 2026 and extended to December 31, 2027. Jones County adopted battery-storage and data-mining moratoriums 5-0 on October 15, 2024, running through April 15, 2025; we found no extension, and neither is in the platform. Interconnection requests are from LBNL Queued Up (data through 2025); population is the ACS 2020-2024 model input.</w:t>
+        <w:t xml:space="preserve"> Scores describe county profiles, not restriction status. Cedar's severe record is its 2023 solar ordinance (1,250 feet from residences, half a mile between projects); Buchanan's is a battery-storage moratorium adopted January 2026 and extended to December 31, 2027. Jones County adopted a battery-storage moratorium 5-0 on October 15, 2024, running through April 15, 2025; the board's later minutes record no extension, and the platform's review queue now holds it as expired, which is not published. A data-mining moratorium adopted the same day is not a renewables record. Interconnection requests are from LBNL Queued Up (data through 2025); population is the ACS 2020-2024 model input.</w:t>
       </w:r>
     </w:p>
   </w:footnote>
@@ -11192,6 +11192,12 @@
     </w:lvlOverride>
   </w:num>
   <w:num w:numId="14">
+    <w:abstractNumId w:val="10"/>
+    <w:lvlOverride w:ilvl="0">
+      <w:startOverride w:val="1"/>
+    </w:lvlOverride>
+  </w:num>
+  <w:num w:numId="15">
     <w:abstractNumId w:val="10"/>
     <w:lvlOverride w:ilvl="0">
       <w:startOverride w:val="1"/>

</xml_diff>